<commit_message>
Lords of Waterdeep added
</commit_message>
<xml_diff>
--- a/2020_Christmas_List.docx
+++ b/2020_Christmas_List.docx
@@ -1018,7 +1018,10 @@
         </w:numPr>
         <w:ind w:left="0"/>
         <w:rPr>
-          <w:rFonts w:cs="Arial"/>
+          <w:rStyle w:val="Hyperlink"/>
+          <w:rFonts w:cs="Arial"/>
+          <w:color w:val="auto"/>
+          <w:u w:val="none"/>
         </w:rPr>
       </w:pPr>
       <w:r>
@@ -1034,6 +1037,48 @@
         <w:t xml:space="preserve">– e.g., </w:t>
       </w:r>
       <w:hyperlink r:id="rId26" w:history="1">
+        <w:r>
+          <w:rPr>
+            <w:rStyle w:val="Hyperlink"/>
+            <w:rFonts w:cs="Arial"/>
+          </w:rPr>
+          <w:t>Amazon link</w:t>
+        </w:r>
+      </w:hyperlink>
+    </w:p>
+    <w:p>
+      <w:pPr>
+        <w:pStyle w:val="ListParagraph"/>
+        <w:numPr>
+          <w:ilvl w:val="0"/>
+          <w:numId w:val="2"/>
+        </w:numPr>
+        <w:ind w:left="0"/>
+        <w:rPr>
+          <w:rFonts w:cs="Arial"/>
+        </w:rPr>
+      </w:pPr>
+      <w:r>
+        <w:rPr>
+          <w:rFonts w:cs="Arial"/>
+        </w:rPr>
+        <w:t xml:space="preserve">Lords of </w:t>
+      </w:r>
+      <w:proofErr w:type="spellStart"/>
+      <w:r>
+        <w:rPr>
+          <w:rFonts w:cs="Arial"/>
+        </w:rPr>
+        <w:t>Waterdeep</w:t>
+      </w:r>
+      <w:proofErr w:type="spellEnd"/>
+      <w:r>
+        <w:rPr>
+          <w:rFonts w:cs="Arial"/>
+        </w:rPr>
+        <w:t xml:space="preserve"> (board game) – e.g., </w:t>
+      </w:r>
+      <w:hyperlink r:id="rId27" w:history="1">
         <w:r>
           <w:rPr>
             <w:rStyle w:val="Hyperlink"/>

</xml_diff>

<commit_message>
Root board game added to list
</commit_message>
<xml_diff>
--- a/2020_Christmas_List.docx
+++ b/2020_Christmas_List.docx
@@ -58,21 +58,7 @@
           <w:sz w:val="32"/>
           <w:szCs w:val="32"/>
         </w:rPr>
-        <w:t>February</w:t>
-      </w:r>
-      <w:r>
-        <w:rPr>
-          <w:sz w:val="32"/>
-          <w:szCs w:val="32"/>
-        </w:rPr>
-        <w:t xml:space="preserve"> </w:t>
-      </w:r>
-      <w:r>
-        <w:rPr>
-          <w:sz w:val="32"/>
-          <w:szCs w:val="32"/>
-        </w:rPr>
-        <w:t>16</w:t>
+        <w:t>March 10</w:t>
       </w:r>
       <w:r>
         <w:rPr>
@@ -209,21 +195,7 @@
             <w:rStyle w:val="Hyperlink"/>
             <w:rFonts w:cs="Arial"/>
           </w:rPr>
-          <w:t>Ama</w:t>
-        </w:r>
-        <w:r>
-          <w:rPr>
-            <w:rStyle w:val="Hyperlink"/>
-            <w:rFonts w:cs="Arial"/>
-          </w:rPr>
-          <w:t>z</w:t>
-        </w:r>
-        <w:r>
-          <w:rPr>
-            <w:rStyle w:val="Hyperlink"/>
-            <w:rFonts w:cs="Arial"/>
-          </w:rPr>
-          <w:t>on link</w:t>
+          <w:t>Amazon link</w:t>
         </w:r>
       </w:hyperlink>
     </w:p>
@@ -865,6 +837,43 @@
         <w:t xml:space="preserve"> (board game) – e.g., </w:t>
       </w:r>
       <w:hyperlink r:id="rId22" w:history="1">
+        <w:r>
+          <w:rPr>
+            <w:rStyle w:val="Hyperlink"/>
+            <w:rFonts w:cs="Arial"/>
+          </w:rPr>
+          <w:t>Amazon link</w:t>
+        </w:r>
+      </w:hyperlink>
+    </w:p>
+    <w:p>
+      <w:pPr>
+        <w:pStyle w:val="ListParagraph"/>
+        <w:numPr>
+          <w:ilvl w:val="0"/>
+          <w:numId w:val="2"/>
+        </w:numPr>
+        <w:ind w:left="360"/>
+        <w:rPr>
+          <w:rStyle w:val="Hyperlink"/>
+          <w:rFonts w:cs="Arial"/>
+          <w:color w:val="auto"/>
+          <w:u w:val="none"/>
+        </w:rPr>
+      </w:pPr>
+      <w:r>
+        <w:rPr>
+          <w:rFonts w:cs="Arial"/>
+        </w:rPr>
+        <w:t>Root</w:t>
+      </w:r>
+      <w:r>
+        <w:rPr>
+          <w:rFonts w:cs="Arial"/>
+        </w:rPr>
+        <w:t xml:space="preserve"> (board game) – e.g., </w:t>
+      </w:r>
+      <w:hyperlink r:id="rId23" w:history="1">
         <w:r>
           <w:rPr>
             <w:rStyle w:val="Hyperlink"/>

</xml_diff>